<commit_message>
docs: remove mencoes socioeconomicas e adequa RT-TDS estritamente ao sistema atual
</commit_message>
<xml_diff>
--- a/RT-TDS-2026-018_v0.4(1).docx
+++ b/RT-TDS-2026-018_v0.4(1).docx
@@ -3291,13 +3291,8 @@
           <w:rFonts w:ascii="Arial" w:hAnsi="Arial" w:cs="Arial"/>
         </w:rPr>
       </w:pPr>
-      <w:bookmarkStart w:id="8" w:name="_Toc144315823"/>
-      <w:bookmarkStart w:id="9" w:name="_Toc144318441"/>
-      <w:r>
-        <w:rPr>
-          <w:rFonts w:ascii="Arial" w:hAnsi="Arial" w:cs="Arial"/>
-        </w:rPr>
-        <w:t>Coletar dados públicos de criminalidade urbana;</w:t>
+      <w:r>
+        <w:t>Coletar dados públicos de criminalidade urbana do Estado de São Paulo;</w:t>
       </w:r>
     </w:p>
     <w:p>
@@ -3312,10 +3307,7 @@
         </w:rPr>
       </w:pPr>
       <w:r>
-        <w:rPr>
-          <w:rFonts w:ascii="Arial" w:hAnsi="Arial" w:cs="Arial"/>
-        </w:rPr>
-        <w:t>Coletar dados socioeconômicos das regiões analisadas;</w:t>
+        <w:t>Implementar armazenamento e indexação geoespacial de alta performance com PostgreSQL e PostGIS;</w:t>
       </w:r>
     </w:p>
     <w:p>
@@ -3330,10 +3322,7 @@
         </w:rPr>
       </w:pPr>
       <w:r>
-        <w:rPr>
-          <w:rFonts w:ascii="Arial" w:hAnsi="Arial" w:cs="Arial"/>
-        </w:rPr>
-        <w:t>Realizar o tratamento, limpeza e padronização dos dados;</w:t>
+        <w:t>Realizar o tratamento, limpeza, deduplicação e padronização das coordenadas geográficas;</w:t>
       </w:r>
     </w:p>
     <w:p>
@@ -3348,10 +3337,7 @@
         </w:rPr>
       </w:pPr>
       <w:r>
-        <w:rPr>
-          <w:rFonts w:ascii="Arial" w:hAnsi="Arial" w:cs="Arial"/>
-        </w:rPr>
-        <w:t>Integrar bases de dados criminais e socioeconômicas por região geográfica;</w:t>
+        <w:t>Desenvolver mecanismos de Lazy Loading espacial e visões materializadas para otimização de consultas;</w:t>
       </w:r>
     </w:p>
     <w:p>
@@ -3366,10 +3352,7 @@
         </w:rPr>
       </w:pPr>
       <w:r>
-        <w:rPr>
-          <w:rFonts w:ascii="Arial" w:hAnsi="Arial" w:cs="Arial"/>
-        </w:rPr>
-        <w:t>Realizar análise estatística exploratória dos dados;</w:t>
+        <w:t>Realizar análise estatística exploratória e diagnósticos temporais das tipologias penais;</w:t>
       </w:r>
     </w:p>
     <w:p>
@@ -3384,10 +3367,7 @@
         </w:rPr>
       </w:pPr>
       <w:r>
-        <w:rPr>
-          <w:rFonts w:ascii="Arial" w:hAnsi="Arial" w:cs="Arial"/>
-        </w:rPr>
-        <w:t>Aplicar algoritmos de aprendizado de máquina para identificação de padrões e agrupamentos;</w:t>
+        <w:t>Desenvolver modelo matemático preditivo de séries temporais com decomposição harmônica de Fourier e regularização Ridge;</w:t>
       </w:r>
     </w:p>
     <w:p>
@@ -3402,10 +3382,7 @@
         </w:rPr>
       </w:pPr>
       <w:r>
-        <w:rPr>
-          <w:rFonts w:ascii="Arial" w:hAnsi="Arial" w:cs="Arial"/>
-        </w:rPr>
-        <w:t>Desenvolver visualizações geoespaciais e temporais dos dados;</w:t>
+        <w:t>Implementar a propagação de incerteza para o cálculo de intervalos de confiança estocásticos a 95%;</w:t>
       </w:r>
     </w:p>
     <w:p>
@@ -3420,10 +3397,7 @@
         </w:rPr>
       </w:pPr>
       <w:r>
-        <w:rPr>
-          <w:rFonts w:ascii="Arial" w:hAnsi="Arial" w:cs="Arial"/>
-        </w:rPr>
-        <w:t>Construir um dashboard web interativo para visualização dos resultados;</w:t>
+        <w:t>Construir um dashboard web interativo minimalista e responsivo em Streamlit;</w:t>
       </w:r>
     </w:p>
     <w:p>
@@ -3438,10 +3412,7 @@
         </w:rPr>
       </w:pPr>
       <w:r>
-        <w:rPr>
-          <w:rFonts w:ascii="Arial" w:hAnsi="Arial" w:cs="Arial"/>
-        </w:rPr>
-        <w:t>Analisar a relação entre indicadores socioeconômicos e índices de criminalidade.</w:t>
+        <w:t>Integrar um Copiloto de inteligência policial com inteligência artificial generativa e grounding factual no banco de dados.</w:t>
       </w:r>
     </w:p>
     <w:p>
@@ -3521,10 +3492,7 @@
         </w:rPr>
       </w:pPr>
       <w:r>
-        <w:rPr>
-          <w:rFonts w:ascii="Arial" w:hAnsi="Arial" w:cs="Arial"/>
-        </w:rPr>
-        <w:t xml:space="preserve">Importação e análise de dados de criminalidade; </w:t>
+        <w:t>Importação e análise de dados de criminalidade pública da SSP-SP;</w:t>
       </w:r>
     </w:p>
     <w:p>
@@ -3539,10 +3507,7 @@
         </w:rPr>
       </w:pPr>
       <w:r>
-        <w:rPr>
-          <w:rFonts w:ascii="Arial" w:hAnsi="Arial" w:cs="Arial"/>
-        </w:rPr>
-        <w:t xml:space="preserve">Tratamento e limpeza de dados; </w:t>
+        <w:t>Tratamento, limpeza e deduplicação de dados espaciais;</w:t>
       </w:r>
     </w:p>
     <w:p>
@@ -3557,10 +3522,7 @@
         </w:rPr>
       </w:pPr>
       <w:r>
-        <w:rPr>
-          <w:rFonts w:ascii="Arial" w:hAnsi="Arial" w:cs="Arial"/>
-        </w:rPr>
-        <w:t xml:space="preserve">Análise estatística dos dados; </w:t>
+        <w:t>Análise estatística descritiva e diagnósticos temporais;</w:t>
       </w:r>
     </w:p>
     <w:p>
@@ -3575,10 +3537,7 @@
         </w:rPr>
       </w:pPr>
       <w:r>
-        <w:rPr>
-          <w:rFonts w:ascii="Arial" w:hAnsi="Arial" w:cs="Arial"/>
-        </w:rPr>
-        <w:t xml:space="preserve">Aplicação de algoritmos de aprendizado de máquina; </w:t>
+        <w:t>Aplicação de modelo preditivo de séries temporais com Fourier e Ridge;</w:t>
       </w:r>
     </w:p>
     <w:p>
@@ -3593,10 +3552,7 @@
         </w:rPr>
       </w:pPr>
       <w:r>
-        <w:rPr>
-          <w:rFonts w:ascii="Arial" w:hAnsi="Arial" w:cs="Arial"/>
-        </w:rPr>
-        <w:t xml:space="preserve">Visualização de dados por meio de gráficos e mapas; </w:t>
+        <w:t>Visualização geoespacial com mapa de calor interativo e lazy loading;</w:t>
       </w:r>
     </w:p>
     <w:p>
@@ -3611,10 +3567,7 @@
         </w:rPr>
       </w:pPr>
       <w:r>
-        <w:rPr>
-          <w:rFonts w:ascii="Arial" w:hAnsi="Arial" w:cs="Arial"/>
-        </w:rPr>
-        <w:t xml:space="preserve">Filtragem de dados por período, região e tipo de crime; </w:t>
+        <w:t>Filtragem dinâmica por município, bairro e natureza penal;</w:t>
       </w:r>
     </w:p>
     <w:p>
@@ -3629,10 +3582,7 @@
         </w:rPr>
       </w:pPr>
       <w:r>
-        <w:rPr>
-          <w:rFonts w:ascii="Arial" w:hAnsi="Arial" w:cs="Arial"/>
-        </w:rPr>
-        <w:t>Apresentação dos resultados em dashboard web.</w:t>
+        <w:t>Apresentação dos resultados em dashboard web e interação com Copiloto IA.</w:t>
       </w:r>
     </w:p>
     <w:p>
@@ -3676,12 +3626,7 @@
         </w:rPr>
       </w:pPr>
       <w:r>
-        <w:rPr>
-          <w:rFonts w:ascii="Arial" w:eastAsia="Times New Roman" w:hAnsi="Arial" w:cs="Arial"/>
-          <w:color w:val="auto"/>
-          <w:lang w:eastAsia="pt-BR"/>
-        </w:rPr>
-        <w:t xml:space="preserve">Monitoramento de crimes em tempo real; </w:t>
+        <w:t>Monitoramento de viaturas ou ocorrências em tempo real;</w:t>
       </w:r>
     </w:p>
     <w:p>
@@ -3698,12 +3643,7 @@
         </w:rPr>
       </w:pPr>
       <w:r>
-        <w:rPr>
-          <w:rFonts w:ascii="Arial" w:eastAsia="Times New Roman" w:hAnsi="Arial" w:cs="Arial"/>
-          <w:color w:val="auto"/>
-          <w:lang w:eastAsia="pt-BR"/>
-        </w:rPr>
-        <w:t xml:space="preserve">Cadastro de usuários ou registro de ocorrências; </w:t>
+        <w:t>Cadastro manual de usuários ou registro de boletins de ocorrência;</w:t>
       </w:r>
     </w:p>
     <w:p>
@@ -3720,12 +3660,7 @@
         </w:rPr>
       </w:pPr>
       <w:r>
-        <w:rPr>
-          <w:rFonts w:ascii="Arial" w:eastAsia="Times New Roman" w:hAnsi="Arial" w:cs="Arial"/>
-          <w:color w:val="auto"/>
-          <w:lang w:eastAsia="pt-BR"/>
-        </w:rPr>
-        <w:t xml:space="preserve">Integração com sistemas policiais; </w:t>
+        <w:t>Integração de escrita com sistemas operacionais policiais fechados;</w:t>
       </w:r>
     </w:p>
     <w:p>
@@ -3742,20 +3677,7 @@
         </w:rPr>
       </w:pPr>
       <w:r>
-        <w:rPr>
-          <w:rFonts w:ascii="Arial" w:eastAsia="Times New Roman" w:hAnsi="Arial" w:cs="Arial"/>
-          <w:color w:val="auto"/>
-          <w:lang w:eastAsia="pt-BR"/>
-        </w:rPr>
-        <w:t>Uso de dados sigilosos ou privados</w:t>
-      </w:r>
-      <w:r>
-        <w:rPr>
-          <w:rFonts w:ascii="Times New Roman" w:eastAsia="Times New Roman" w:hAnsi="Times New Roman" w:cs="Times New Roman"/>
-          <w:color w:val="auto"/>
-          <w:lang w:eastAsia="pt-BR"/>
-        </w:rPr>
-        <w:t>.</w:t>
+        <w:t>Exibição ou armazenamento de dados sigilosos ou privados de cidadãos (LGPD).</w:t>
       </w:r>
     </w:p>
     <w:p>
@@ -4401,14 +4323,7 @@
           <w:bCs/>
         </w:rPr>
       </w:pPr>
-      <w:r>
-        <w:rPr>
-          <w:rFonts w:ascii="Arial" w:hAnsi="Arial" w:cs="Arial"/>
-          <w:b/>
-          <w:bCs/>
-        </w:rPr>
-        <w:t>Exemplo de descrição</w:t>
-      </w:r>
+      <w:r/>
     </w:p>
     <w:p>
       <w:pPr>
@@ -4523,19 +4438,7 @@
         </w:rPr>
       </w:pPr>
       <w:r>
-        <w:rPr>
-          <w:rFonts w:ascii="Arial" w:hAnsi="Arial" w:cs="Arial"/>
-          <w:b/>
-          <w:bCs/>
-        </w:rPr>
-        <w:lastRenderedPageBreak/>
-        <w:t>Visualizar Mapa de Ocorrências:</w:t>
-      </w:r>
-      <w:r>
-        <w:rPr>
-          <w:rFonts w:ascii="Arial" w:hAnsi="Arial" w:cs="Arial"/>
-        </w:rPr>
-        <w:t xml:space="preserve"> Permite ao Usuário Final visualizar os dados espaciais de criminalidade plotados em um mapa interativo, facilitando o reconhecimento de manchas criminais atuais.</w:t>
+        <w:t>Visualizar Mapa Espacial de Ocorrências: Permite ao Usuário Final visualizar os dados espaciais de criminalidade em mapa de calor com lazy loading instantâneo (&lt; 1 ms).</w:t>
       </w:r>
     </w:p>
     <w:p>
@@ -4606,18 +4509,7 @@
         </w:rPr>
       </w:pPr>
       <w:r>
-        <w:rPr>
-          <w:rFonts w:ascii="Arial" w:hAnsi="Arial" w:cs="Arial"/>
-          <w:b/>
-          <w:bCs/>
-        </w:rPr>
-        <w:t>Consultar Predição de Zonas de Risco:</w:t>
-      </w:r>
-      <w:r>
-        <w:rPr>
-          <w:rFonts w:ascii="Arial" w:hAnsi="Arial" w:cs="Arial"/>
-        </w:rPr>
-        <w:t xml:space="preserve"> O usuário aciona o modelo preditivo para projetar tendências e visualizar áreas de risco potencial baseadas no agrupamento estatístico histórico.</w:t>
+        <w:t>Consultar Predição de Séries Temporais: O usuário aciona o modelo preditivo para projetar o volume de ocorrências com intervalos de confiança a 95% e sazonalidade de Fourier.</w:t>
       </w:r>
     </w:p>
     <w:p>
@@ -4633,18 +4525,7 @@
         </w:rPr>
       </w:pPr>
       <w:r>
-        <w:rPr>
-          <w:rFonts w:ascii="Arial" w:hAnsi="Arial" w:cs="Arial"/>
-          <w:b/>
-          <w:bCs/>
-        </w:rPr>
-        <w:t>Ingerir Dados da SSP:</w:t>
-      </w:r>
-      <w:r>
-        <w:rPr>
-          <w:rFonts w:ascii="Arial" w:hAnsi="Arial" w:cs="Arial"/>
-        </w:rPr>
-        <w:t xml:space="preserve"> Ação disparada pelo Sistema Automático para buscar, extrair e carregar os novos lotes de dados públicos fornecidos pela Secretaria de Segurança Pública e IBGE.</w:t>
+        <w:t>Ingerir Dados da SSP: Ação disparada pelo Sistema Automático para buscar, extrair e carregar os novos lotes de dados públicos fornecidos pela Secretaria de Segurança Pública de São Paulo.</w:t>
       </w:r>
     </w:p>
     <w:p>
@@ -4799,7 +4680,7 @@
         </w:rPr>
       </w:pPr>
       <w:r>
-        <w:t>DashboardUI (Interface de Apresentação): Módulo principal de front-end gerado via Streamlit (src/visualization/app.py). Renderiza a interface minimalista, instancia o mapa Folium, gerencia abas analíticas, hospeda o chat lateral e conecta os inputs do usuário aos serviços de retaguarda.</w:t>
+        <w:t>DashboardUI (Interface de Apresentação): Módulo principal de front-end gerado via Streamlit. Renderiza a interface minimalista, instancia o mapa de calor Folium com lazy loading, gerencia abas analíticas, hospeda o chat lateral e conecta as interações do usuário aos serviços de retaguarda.</w:t>
       </w:r>
     </w:p>
     <w:p>
@@ -4815,7 +4696,7 @@
         </w:rPr>
       </w:pPr>
       <w:r>
-        <w:t>CriminalPredictor (Motor Preditivo Matemático): Classe analítica (src/models/predictor.py) que implementa a modelagem de séries temporais. Encapsula o estimador Ridge (L2), a decomposição harmônica de Fourier (seno e cosseno para ciclo anual de 12 meses), o cálculo de erro padrão SE(h) para Intervalos de Confiança a 95% e as métricas R², RMSE, MAE, MAPE e AIC.</w:t>
+        <w:t>CriminalPredictor (Motor Preditivo Matemático): Classe analítica que implementa a modelagem de séries temporais. Encapsula o estimador Ridge (L2), a decomposição harmônica de Fourier (seno e cosseno para ciclo anual de 12 meses), a propagação de erro padrão SE(h) para Intervalos de Confiança a 95% e as métricas R², RMSE, MAE, MAPE e AIC.</w:t>
       </w:r>
     </w:p>
     <w:p>
@@ -4831,7 +4712,7 @@
         </w:rPr>
       </w:pPr>
       <w:r>
-        <w:t>DataProcessor (Tratamento e Engenharia de Features): Módulo ETL (src/processing/clean_processor.py) encarregado da limpeza, conversão de formatos de coordenadas, filtragem por bounding box do Estado de SP, deduplicação de boletins e injeção de atributos temporais discretizados.</w:t>
+        <w:t>DataProcessor (Tratamento e Engenharia de Features): Módulo encarregado da limpeza, conversão de formatos de coordenadas, filtragem por bounding box do Estado de SP, deduplicação de boletins por NUM_BO e injeção de atributos temporais discretizados.</w:t>
       </w:r>
     </w:p>
     <w:p>
@@ -4847,7 +4728,7 @@
         </w:rPr>
       </w:pPr>
       <w:r>
-        <w:t>DatabaseManager (Persistência e Otimização PostGIS): Gerenciador de acesso ao banco (src/ingestion/database.py) que implementa Connection Pooling no SQLAlchemy, execução de queries espaciais GiST (ST_DWithin), lazy loading de coordenadas (&lt; 1 ms), consultas instantâneas em Visões Materializadas e busca analítica contextual para o Copiloto IA.</w:t>
+        <w:t>DatabaseManager (Persistência e Otimização PostGIS): Gerenciador de acesso ao banco de dados que implementa Connection Pooling no SQLAlchemy, execução de queries espaciais GiST (ST_DWithin), lazy loading de coordenadas (&lt; 1 ms), consultas instantâneas em Visões Materializadas e busca analítica contextual para o Copiloto IA (SecurityCopilot).</w:t>
       </w:r>
     </w:p>
     <w:p>
@@ -5286,52 +5167,7 @@
         </w:rPr>
       </w:pPr>
       <w:r>
-        <w:rPr>
-          <w:rFonts w:ascii="Arial" w:hAnsi="Arial" w:cs="Arial"/>
-        </w:rPr>
-        <w:t xml:space="preserve">O sistema interage diretamente com o </w:t>
-      </w:r>
-      <w:r>
-        <w:rPr>
-          <w:rFonts w:ascii="Arial" w:hAnsi="Arial" w:cs="Arial"/>
-          <w:b/>
-          <w:bCs/>
-        </w:rPr>
-        <w:t>Usuário Final</w:t>
-      </w:r>
-      <w:r>
-        <w:rPr>
-          <w:rFonts w:ascii="Arial" w:hAnsi="Arial" w:cs="Arial"/>
-        </w:rPr>
-        <w:t xml:space="preserve"> (que acessa o dashboard para análises visuais e tomada de decisão) e consome informações essenciais de dois provedores externos de dados: o </w:t>
-      </w:r>
-      <w:r>
-        <w:rPr>
-          <w:rFonts w:ascii="Arial" w:hAnsi="Arial" w:cs="Arial"/>
-          <w:b/>
-          <w:bCs/>
-        </w:rPr>
-        <w:t>Portal de Dados Abertos da SSP-SP</w:t>
-      </w:r>
-      <w:r>
-        <w:rPr>
-          <w:rFonts w:ascii="Arial" w:hAnsi="Arial" w:cs="Arial"/>
-        </w:rPr>
-        <w:t xml:space="preserve">, que fornece os registros brutos de boletins de ocorrência, e a base do </w:t>
-      </w:r>
-      <w:r>
-        <w:rPr>
-          <w:rFonts w:ascii="Arial" w:hAnsi="Arial" w:cs="Arial"/>
-          <w:b/>
-          <w:bCs/>
-        </w:rPr>
-        <w:t>IBGE / Fundação SEADE</w:t>
-      </w:r>
-      <w:r>
-        <w:rPr>
-          <w:rFonts w:ascii="Arial" w:hAnsi="Arial" w:cs="Arial"/>
-        </w:rPr>
-        <w:t>, que fornece a malha demográfica e os indicadores socioeconômicos necessários para o cruzamento espacial.</w:t>
+        <w:t>O sistema interage diretamente com o Usuário Final (que acessa o dashboard e o chat interativo para análises táticas e tomada de decisão operacional) e consome os registros públicos de boletins de ocorrência fornecidos pelo Portal de Dados Abertos da Secretaria de Segurança Pública de São Paulo (SSP-SP), além de se comunicar com a API do Google Gemini para o fornecimento de inteligência contextual.</w:t>
       </w:r>
     </w:p>
     <w:p>
@@ -5588,26 +5424,7 @@
           <w:rFonts w:ascii="Arial" w:hAnsi="Arial" w:cs="Arial"/>
         </w:rPr>
       </w:pPr>
-      <w:r>
-        <w:rPr>
-          <w:rFonts w:ascii="Arial" w:hAnsi="Arial" w:cs="Arial"/>
-        </w:rPr>
-        <w:t xml:space="preserve">Apresente os componentes internos do </w:t>
-      </w:r>
-      <w:proofErr w:type="spellStart"/>
-      <w:r>
-        <w:rPr>
-          <w:rFonts w:ascii="Arial" w:hAnsi="Arial" w:cs="Arial"/>
-        </w:rPr>
-        <w:t>backend</w:t>
-      </w:r>
-      <w:proofErr w:type="spellEnd"/>
-      <w:r>
-        <w:rPr>
-          <w:rFonts w:ascii="Arial" w:hAnsi="Arial" w:cs="Arial"/>
-        </w:rPr>
-        <w:t>.</w:t>
-      </w:r>
+      <w:r/>
     </w:p>
     <w:p>
       <w:pPr>
@@ -5619,14 +5436,7 @@
           <w:bCs/>
         </w:rPr>
       </w:pPr>
-      <w:r>
-        <w:rPr>
-          <w:rFonts w:ascii="Arial" w:hAnsi="Arial" w:cs="Arial"/>
-          <w:b/>
-          <w:bCs/>
-        </w:rPr>
-        <w:t>Exemplo</w:t>
-      </w:r>
+      <w:r/>
     </w:p>
     <w:p>
       <w:pPr>
@@ -5641,46 +5451,7 @@
         </w:rPr>
       </w:pPr>
       <w:r>
-        <w:rPr>
-          <w:rFonts w:ascii="Arial" w:hAnsi="Arial" w:cs="Arial"/>
-          <w:b/>
-          <w:bCs/>
-        </w:rPr>
-        <w:t>Módulo de Visualização (Dashboard):</w:t>
-      </w:r>
-      <w:r>
-        <w:rPr>
-          <w:rFonts w:ascii="Arial" w:hAnsi="Arial" w:cs="Arial"/>
-        </w:rPr>
-        <w:t xml:space="preserve"> Responsável pela interface interativa gerada em </w:t>
-      </w:r>
-      <w:proofErr w:type="spellStart"/>
-      <w:r>
-        <w:rPr>
-          <w:rFonts w:ascii="Arial" w:hAnsi="Arial" w:cs="Arial"/>
-        </w:rPr>
-        <w:t>Streamlit</w:t>
-      </w:r>
-      <w:proofErr w:type="spellEnd"/>
-      <w:r>
-        <w:rPr>
-          <w:rFonts w:ascii="Arial" w:hAnsi="Arial" w:cs="Arial"/>
-        </w:rPr>
-        <w:t xml:space="preserve">. Consome os resultados analíticos processados para renderizar gráficos dinâmicos e mapas de calor </w:t>
-      </w:r>
-      <w:proofErr w:type="spellStart"/>
-      <w:r>
-        <w:rPr>
-          <w:rFonts w:ascii="Arial" w:hAnsi="Arial" w:cs="Arial"/>
-        </w:rPr>
-        <w:t>geoespaciais</w:t>
-      </w:r>
-      <w:proofErr w:type="spellEnd"/>
-      <w:r>
-        <w:rPr>
-          <w:rFonts w:ascii="Arial" w:hAnsi="Arial" w:cs="Arial"/>
-        </w:rPr>
-        <w:t>.</w:t>
+        <w:t>Módulo de Visualização (Dashboard): Responsável pela interface interativa gerada em Streamlit. Consome os dados tabulares e coordenadas via Lazy Loading para renderizar gráficos analíticos dinâmicos, o mapa de calor geoespacial e o chat lateral contínuo.</w:t>
       </w:r>
     </w:p>
     <w:p>
@@ -5696,64 +5467,7 @@
         </w:rPr>
       </w:pPr>
       <w:r>
-        <w:rPr>
-          <w:rFonts w:ascii="Arial" w:hAnsi="Arial" w:cs="Arial"/>
-          <w:b/>
-          <w:bCs/>
-        </w:rPr>
-        <w:t>Módulo de Modelagem (</w:t>
-      </w:r>
-      <w:proofErr w:type="spellStart"/>
-      <w:r>
-        <w:rPr>
-          <w:rFonts w:ascii="Arial" w:hAnsi="Arial" w:cs="Arial"/>
-          <w:b/>
-          <w:bCs/>
-        </w:rPr>
-        <w:t>Machine</w:t>
-      </w:r>
-      <w:proofErr w:type="spellEnd"/>
-      <w:r>
-        <w:rPr>
-          <w:rFonts w:ascii="Arial" w:hAnsi="Arial" w:cs="Arial"/>
-          <w:b/>
-          <w:bCs/>
-        </w:rPr>
-        <w:t xml:space="preserve"> Learning):</w:t>
-      </w:r>
-      <w:r>
-        <w:rPr>
-          <w:rFonts w:ascii="Arial" w:hAnsi="Arial" w:cs="Arial"/>
-        </w:rPr>
-        <w:t xml:space="preserve"> Núcleo preditivo da aplicação que utiliza a biblioteca </w:t>
-      </w:r>
-      <w:proofErr w:type="spellStart"/>
-      <w:r>
-        <w:rPr>
-          <w:rFonts w:ascii="Arial" w:hAnsi="Arial" w:cs="Arial"/>
-        </w:rPr>
-        <w:t>Scikit-Learn</w:t>
-      </w:r>
-      <w:proofErr w:type="spellEnd"/>
-      <w:r>
-        <w:rPr>
-          <w:rFonts w:ascii="Arial" w:hAnsi="Arial" w:cs="Arial"/>
-        </w:rPr>
-        <w:t>. É encarregado de treinar os modelos baseados em dados históricos, aplicar algoritmos de agrupamento espacial (</w:t>
-      </w:r>
-      <w:proofErr w:type="spellStart"/>
-      <w:r>
-        <w:rPr>
-          <w:rFonts w:ascii="Arial" w:hAnsi="Arial" w:cs="Arial"/>
-        </w:rPr>
-        <w:t>clustering</w:t>
-      </w:r>
-      <w:proofErr w:type="spellEnd"/>
-      <w:r>
-        <w:rPr>
-          <w:rFonts w:ascii="Arial" w:hAnsi="Arial" w:cs="Arial"/>
-        </w:rPr>
-        <w:t>) e gerar as inferências de risco de criminalidade.</w:t>
+        <w:t>Módulo de Modelagem (Machine Learning e IA): Núcleo analítico que utiliza Scikit-Learn e a API do Google Gemini. Treina o modelo preditivo de séries temporais com base harmônica de Fourier e regularização Ridge, além de fornecer o Copiloto IA de assistência policial com grounding em tempo real.</w:t>
       </w:r>
     </w:p>
     <w:p>
@@ -5769,89 +5483,7 @@
         </w:rPr>
       </w:pPr>
       <w:r>
-        <w:rPr>
-          <w:rFonts w:ascii="Arial" w:hAnsi="Arial" w:cs="Arial"/>
-          <w:b/>
-          <w:bCs/>
-        </w:rPr>
-        <w:t>Módulo de Processamento (ETL):</w:t>
-      </w:r>
-      <w:r>
-        <w:rPr>
-          <w:rFonts w:ascii="Arial" w:hAnsi="Arial" w:cs="Arial"/>
-        </w:rPr>
-        <w:t xml:space="preserve"> Motor de transformação baseado em Pandas e </w:t>
-      </w:r>
-      <w:proofErr w:type="spellStart"/>
-      <w:r>
-        <w:rPr>
-          <w:rFonts w:ascii="Arial" w:hAnsi="Arial" w:cs="Arial"/>
-        </w:rPr>
-        <w:t>GeoPandas</w:t>
-      </w:r>
-      <w:proofErr w:type="spellEnd"/>
-      <w:r>
-        <w:rPr>
-          <w:rFonts w:ascii="Arial" w:hAnsi="Arial" w:cs="Arial"/>
-        </w:rPr>
-        <w:t xml:space="preserve">. Realiza a limpeza de valores ausentes, a engenharia de </w:t>
-      </w:r>
-      <w:proofErr w:type="spellStart"/>
-      <w:r>
-        <w:rPr>
-          <w:rFonts w:ascii="Arial" w:hAnsi="Arial" w:cs="Arial"/>
-          <w:i/>
-          <w:iCs/>
-        </w:rPr>
-        <w:t>features</w:t>
-      </w:r>
-      <w:proofErr w:type="spellEnd"/>
-      <w:r>
-        <w:rPr>
-          <w:rFonts w:ascii="Arial" w:hAnsi="Arial" w:cs="Arial"/>
-        </w:rPr>
-        <w:t xml:space="preserve"> e a </w:t>
-      </w:r>
-      <w:r>
-        <w:rPr>
-          <w:rFonts w:ascii="Arial" w:hAnsi="Arial" w:cs="Arial"/>
-        </w:rPr>
-        <w:lastRenderedPageBreak/>
-        <w:t>junção espacial (</w:t>
-      </w:r>
-      <w:proofErr w:type="spellStart"/>
-      <w:r>
-        <w:rPr>
-          <w:rFonts w:ascii="Arial" w:hAnsi="Arial" w:cs="Arial"/>
-          <w:i/>
-          <w:iCs/>
-        </w:rPr>
-        <w:t>spatial</w:t>
-      </w:r>
-      <w:proofErr w:type="spellEnd"/>
-      <w:r>
-        <w:rPr>
-          <w:rFonts w:ascii="Arial" w:hAnsi="Arial" w:cs="Arial"/>
-          <w:i/>
-          <w:iCs/>
-        </w:rPr>
-        <w:t xml:space="preserve"> </w:t>
-      </w:r>
-      <w:proofErr w:type="spellStart"/>
-      <w:r>
-        <w:rPr>
-          <w:rFonts w:ascii="Arial" w:hAnsi="Arial" w:cs="Arial"/>
-          <w:i/>
-          <w:iCs/>
-        </w:rPr>
-        <w:t>join</w:t>
-      </w:r>
-      <w:proofErr w:type="spellEnd"/>
-      <w:r>
-        <w:rPr>
-          <w:rFonts w:ascii="Arial" w:hAnsi="Arial" w:cs="Arial"/>
-        </w:rPr>
-        <w:t>) entre os dados socioeconômicos e os registros de ocorrências criminais.</w:t>
+        <w:t>Módulo de Processamento (ETL): Motor de transformação baseado em Pandas e NumPy. Realiza a limpeza de valores ausentes, filtragem espacial restrita ao Estado de São Paulo, deduplicação de ocorrências por identificador único (NUM_BO) e engenharia de atributos temporais (ano, mês, dia, dia da semana e hora da ocorrência).</w:t>
       </w:r>
     </w:p>
     <w:p>
@@ -5867,48 +5499,7 @@
         </w:rPr>
       </w:pPr>
       <w:r>
-        <w:rPr>
-          <w:rFonts w:ascii="Arial" w:hAnsi="Arial" w:cs="Arial"/>
-          <w:b/>
-          <w:bCs/>
-        </w:rPr>
-        <w:t>Módulo de Ingestão (Acesso a Dados):</w:t>
-      </w:r>
-      <w:r>
-        <w:rPr>
-          <w:rFonts w:ascii="Arial" w:hAnsi="Arial" w:cs="Arial"/>
-        </w:rPr>
-        <w:t xml:space="preserve"> Interface responsável pela comunicação direta com o repositório PostgreSQL/</w:t>
-      </w:r>
-      <w:proofErr w:type="spellStart"/>
-      <w:r>
-        <w:rPr>
-          <w:rFonts w:ascii="Arial" w:hAnsi="Arial" w:cs="Arial"/>
-        </w:rPr>
-        <w:t>PostGIS</w:t>
-      </w:r>
-      <w:proofErr w:type="spellEnd"/>
-      <w:r>
-        <w:rPr>
-          <w:rFonts w:ascii="Arial" w:hAnsi="Arial" w:cs="Arial"/>
-        </w:rPr>
-        <w:t xml:space="preserve">. Concentra as rotinas de extração dos dados brutos e a persistência dos </w:t>
-      </w:r>
-      <w:proofErr w:type="spellStart"/>
-      <w:r>
-        <w:rPr>
-          <w:rFonts w:ascii="Arial" w:hAnsi="Arial" w:cs="Arial"/>
-          <w:i/>
-          <w:iCs/>
-        </w:rPr>
-        <w:t>DataFrames</w:t>
-      </w:r>
-      <w:proofErr w:type="spellEnd"/>
-      <w:r>
-        <w:rPr>
-          <w:rFonts w:ascii="Arial" w:hAnsi="Arial" w:cs="Arial"/>
-        </w:rPr>
-        <w:t xml:space="preserve"> consolidados.</w:t>
+        <w:t>Módulo de Ingestão e Persistência (PostgreSQL/PostGIS): Interface responsável pela comunicação direta com o repositório relacional e geoespacial. Gerencia o Connection Pooling via SQLAlchemy, a execução de queries espaciais GiST, o lazy loading de coordenadas e o acesso instantâneo a Visões Materializadas.</w:t>
       </w:r>
     </w:p>
     <w:p>

</xml_diff>

<commit_message>
docs: deixa secoes posteriores ao sistema pronto em branco no RT-TDS
</commit_message>
<xml_diff>
--- a/RT-TDS-2026-018_v0.4(1).docx
+++ b/RT-TDS-2026-018_v0.4(1).docx
@@ -5788,6 +5788,7 @@
           <w:rFonts w:ascii="Arial" w:hAnsi="Arial" w:cs="Arial"/>
         </w:rPr>
       </w:pPr>
+      <w:r/>
     </w:p>
     <w:p>
       <w:pPr>
@@ -5809,19 +5810,7 @@
           <w:rFonts w:ascii="Arial" w:hAnsi="Arial" w:cs="Arial"/>
         </w:rPr>
       </w:pPr>
-      <w:r>
-        <w:t>O desenvolvimento do Analytics Criminal SP contemplou cinco etapas principais:</w:t>
-        <w:br/>
-        <w:t>1. Pipeline de Engenharia de Dados (ETL): Implementação da ingestão de 834.385 boletins de ocorrência públicos da SSP-SP, aplicando filtros de bounding box para o Estado de São Paulo, deduplicação por NUM_BO e enriquecimento com engenharia de atributos temporais.</w:t>
-        <w:br/>
-        <w:t>2. Otimização de Banco de Dados com PostGIS: Configuração do container Docker do PostgreSQL 15 com extensão PostGIS. Criação da coluna geométrica nativa geom (Point, 4326), índice espacial GiST (R-Tree), índice geodésico para consultas em metros (ST_DWithin), índices compostos B-Tree, índices funcionais UPPER e Visões Materializadas para KPIs municipais instantâneos (&lt; 0.1 ms).</w:t>
-        <w:br/>
-        <w:t>3. Lazy Loading Espacial e Interface Streamlit: Redesenho do dashboard com visual limpo, moderno e minimalista. Implementação do carregamento preguiçoso (Lazy Loading) separando as coordenadas para o mapa (0.65 ms) dos dados tabulares pesados, reduzindo em 90% a transferência de dados.</w:t>
-        <w:br/>
-        <w:t>4. Modelagem Matemática Preditiva: Implementação do CriminalPredictor com decomposição harmônica de Fourier (seno e cosseno) para capturar a sazonalidade de 12 meses, regularização Ridge (L2) para estabilidade contra overfitting e propagação de incerteza para intervalos de confiança a 95%.</w:t>
-        <w:br/>
-        <w:t>5. Copiloto IA Criminal: Integração do modelo Google Gemini 3.6 Flash conectado ao PostGIS via consultas parametrizadas (&lt; 25 ms), posicionando um chat contínuo na barra lateral com extração de entidades e mecanismo de fallback resiliente a limitações de cota.</w:t>
-      </w:r>
+      <w:r/>
     </w:p>
     <w:p>
       <w:pPr>
@@ -5831,13 +5820,11 @@
           <w:rFonts w:ascii="Arial" w:hAnsi="Arial" w:cs="Arial"/>
         </w:rPr>
       </w:pPr>
-      <w:r>
-        <w:t>Decisões Técnicas e Desafios Superados:</w:t>
-        <w:br/>
-        <w:t>A alta volumetria (834k registros) inicialmente causava latência de renderização no mapa Folium; o problema foi superado com o Lazy Loading espacial e índices GiST. Para prevenir sobrecarga de conexões no Streamlit, configurou-se um Connection Pool de 15 conexões no SQLAlchemy. Na integração com o Gemini, desenvolveu-se um fallback analítico estruturado para contornar o resfriamento de cota da camada gratuita (HTTP 429).</w:t>
-      </w:r>
-    </w:p>
-    <w:p/>
+      <w:r/>
+    </w:p>
+    <w:p>
+      <w:r/>
+    </w:p>
     <w:p>
       <w:pPr>
         <w:pStyle w:val="Ttulo1"/>
@@ -5908,24 +5895,10 @@
           <w:rFonts w:ascii="Arial" w:hAnsi="Arial" w:cs="Arial"/>
         </w:rPr>
       </w:pPr>
-      <w:r>
-        <w:t>A plataforma Analytics Criminal SP foi concluída com êxito e opera com estabilidade sobre a base completa de 834.385 ocorrências criminais do Estado de São Paulo:</w:t>
-        <w:br/>
-        <w:t>1. Desempenho de Consulta e Renderização: O tempo de carregamento de pontos do mapa foi reduzido de ~450 ms para 0.65 ms (Lazy Loading). As consultas espaciais por raio caíram de 296 ms para 7.3 ms (ganho de 40x), e os KPIs municipais passaram a carregar em 0.06 ms (ganho de 770x via Materialized Views).</w:t>
-        <w:br/>
-        <w:t>2. Precisão da Modelagem Preditiva: O modelo Ridge com Fourier demonstrou aderência estatística satisfatória (R² = 0.787 e RMSE = 0.23 em bairros de alta densidade como a Sé), com bandas de confiança probabilísticas a 95% que delimitam o risco para o planejamento policial.</w:t>
-        <w:br/>
-        <w:t>3. Assistência Conversacional com IA: O Copiloto IA responde a dúvidas específicas de bairros e crimes em linguagem natural em tempo real, fornecendo orientações táticas baseadas em evidências.</w:t>
-        <w:br/>
-        <w:t>4. Validação por Testes Automatizados: Construiu-se uma suíte de 26 testes unitários automatizados cobrindo todas as camadas (ETL, PostGIS, Preditor e Copiloto IA), com 100% de taxa de aprovação executando em apenas 0.16 segundos.</w:t>
-      </w:r>
-    </w:p>
-    <w:p>
-      <w:r>
-        <w:pict w14:anchorId="2A56F992">
-          <v:rect id="_x0000_i1025" style="width:0;height:1.5pt" o:hralign="center" o:hrstd="t" o:hr="t" fillcolor="#a0a0a0" stroked="f"/>
-        </w:pict>
-      </w:r>
+      <w:r/>
+    </w:p>
+    <w:p>
+      <w:r/>
     </w:p>
     <w:p>
       <w:pPr>
@@ -5988,20 +5961,14 @@
           <w:rFonts w:ascii="Arial" w:hAnsi="Arial" w:cs="Arial"/>
         </w:rPr>
       </w:pPr>
-      <w:r>
-        <w:t>O desenvolvimento do projeto Analytics Criminal SP atingiu integralmente os objetivos gerais e específicos propostos, demonstrando como a união entre Engenharia de Dados, Bancos de Dados Geoespaciais (PostGIS), Aprendizado de Máquina e Modelos Fundacionais de Inteligência Artificial pode revolucionar a gestão da segurança pública.</w:t>
-        <w:br/>
-        <w:t>A solução comprova a viabilidade técnica de transformar dados governamentais abertos brutos em inteligência acionável e preditiva de alto desempenho. Como trabalhos futuros, sugere-se a expansão da base para outros estados da federação, a inclusão de modelos de redes neurais recorrentes (LSTM) para séries temporais de longo prazo e o desenvolvimento de um aplicativo mobile para consulta direta de policiais em viaturas de campo.</w:t>
-      </w:r>
-    </w:p>
-    <w:p>
-      <w:r>
-        <w:pict w14:anchorId="65B12C48">
-          <v:rect id="_x0000_i1026" style="width:0;height:1.5pt" o:hralign="center" o:hrstd="t" o:hr="t" fillcolor="#a0a0a0" stroked="f"/>
-        </w:pict>
-      </w:r>
-    </w:p>
-    <w:p/>
+      <w:r/>
+    </w:p>
+    <w:p>
+      <w:r/>
+    </w:p>
+    <w:p>
+      <w:r/>
+    </w:p>
     <w:p>
       <w:pPr>
         <w:pStyle w:val="Ttulo1"/>

</xml_diff>

<commit_message>
docs: sintetiza resultados e desenvolvimento e aprimora precisao da modelagem de dados no RT-TDS
</commit_message>
<xml_diff>
--- a/RT-TDS-2026-018_v0.4(1).docx
+++ b/RT-TDS-2026-018_v0.4(1).docx
@@ -4900,7 +4900,7 @@
         </w:rPr>
       </w:pPr>
       <w:r>
-        <w:t>Os dados são provenientes de registros públicos da Secretaria de Segurança Pública de São Paulo (SSP-SP) e passam por tratamento antes de serem persistidos no PostgreSQL 15 com extensão PostGIS 3.3:</w:t>
+        <w:t>A modelagem conceitual do sistema é estruturada a partir dos registros públicos da Secretaria de Segurança Pública de São Paulo (SSP-SP), articulada em torno de três entidades fundamentais (Figura 6): a Ocorrência Criminal (fato temporal e identificador do delito), a Localização Espacial (georreferenciamento e coordenadas geográficas) e a Tipologia Penal (natureza jurídica da rubrica).</w:t>
       </w:r>
     </w:p>
     <w:p>
@@ -4912,7 +4912,7 @@
         </w:rPr>
       </w:pPr>
       <w:r>
-        <w:t>A estrutura de dados é composta pela tabela de fatos espaciais e visões materializadas otimizadas:</w:t>
+        <w:t>Para garantir tempos de resposta analíticos inferiores a 1 segundo sobre a base de 834.385 registros no PostgreSQL 15 / PostGIS 3.3, a persistência física foi estruturada em uma tabela analítica de fatos espaciais com indexação avançada e visões materializadas:</w:t>
       </w:r>
     </w:p>
     <w:p>
@@ -4928,7 +4928,7 @@
         </w:rPr>
       </w:pPr>
       <w:r>
-        <w:t>fatos_criminais: Tabela central contendo 834.385 registros consolidados, com colunas para identificação (num_bo, data_ocorrencia_bo), temporalidade (ano, mes, dia, dia_semana, hora), tipologia (rubrica) e localização (nome_municipio, bairro, latitude, longitude).</w:t>
+        <w:t>fatos_criminais: Tabela de fatos contendo 834.385 registros com atributos de identificação (num_bo), temporais (data_ocorrencia_bo, ano, mes, dia, dia_semana, hora), tipologia (rubrica) e localização (nome_municipio, bairro, latitude, longitude).</w:t>
       </w:r>
     </w:p>
     <w:p>
@@ -4944,7 +4944,7 @@
         </w:rPr>
       </w:pPr>
       <w:r>
-        <w:t>geom (Coluna Espacial PostGIS): Coluna geométrica nativa do tipo geometry(Point, 4326) indexada via GiST (R-Tree), permitindo medições geodésicas em metros e consultas espaciais de alta performance.</w:t>
+        <w:t>Indexação Espacial GiST: Coluna geométrica nativa geom do tipo geometry(Point, 4326) indexada via GiST (R-Tree) e índice funcional geodésico cast(geom as geography) para cálculos de raio em metros (ST_DWithin em ~7 ms).</w:t>
       </w:r>
     </w:p>
     <w:p>
@@ -4960,7 +4960,7 @@
         </w:rPr>
       </w:pPr>
       <w:r>
-        <w:t>Visões Materializadas (mv_kpis_municipios e mv_tendencias_mensais): Agregações pré-computadas armazenadas em disco para entrega de estatísticas consolidadas e tendências mensais em menos de 0.1 ms.</w:t>
+        <w:t>Índices Compostos, Funcionais e Visões Materializadas: Índices B-Tree compostos e funcionais (UPPER no município e bairro para busca rápida na IA em &lt; 25 ms), complementados pelas visões materializadas mv_kpis_municipios e mv_tendencias_mensais para agregações em menos de 0.1 ms.</w:t>
       </w:r>
     </w:p>
     <w:p>
@@ -5810,7 +5810,19 @@
           <w:rFonts w:ascii="Arial" w:hAnsi="Arial" w:cs="Arial"/>
         </w:rPr>
       </w:pPr>
-      <w:r/>
+      <w:r>
+        <w:t>O desenvolvimento do Analytics Criminal SP foi estruturado em cinco frentes técnicas integradas:</w:t>
+        <w:br/>
+        <w:t>1. Pipeline de Engenharia de Dados (ETL): Ingestão, limpeza e deduplicação de 834.385 registros públicos da SSP-SP, com filtragem espacial restrita ao Estado de São Paulo e engenharia de atributos temporais.</w:t>
+        <w:br/>
+        <w:t>2. Banco de Dados Espacial PostGIS: Persistência no PostgreSQL 15 com extensão PostGIS 3.3, coluna geométrica nativa geom (Point, 4326), indexação GiST espacial e geodésica, índices compostos e visões materializadas para agregações submilissegundo (&lt; 0.1 ms).</w:t>
+        <w:br/>
+        <w:t>3. Lazy Loading e Dashboard Reativo: Interface analítica em Streamlit com desacoplamento de carga (coordenadas geoespaciais em 0.65 ms e dados tabulares sob demanda), reduzindo em 90% o tráfego de dados no mapa Folium.</w:t>
+        <w:br/>
+        <w:t>4. Modelagem Matemática Preditiva: Estimador Ridge com expansão harmônica de Fourier (seno e cosseno de 12 meses) e propagação de incerteza (intervalos de confiança probabilísticos a 95%).</w:t>
+        <w:br/>
+        <w:t>5. Copiloto IA com Grounding em Tempo Real: Assistente baseado em Google Gemini 3.6 Flash integrado ao PostGIS via índices funcionais (&lt; 25 ms), dotado de extração de entidades e resiliência a cotas.</w:t>
+      </w:r>
     </w:p>
     <w:p>
       <w:pPr>
@@ -5820,7 +5832,11 @@
           <w:rFonts w:ascii="Arial" w:hAnsi="Arial" w:cs="Arial"/>
         </w:rPr>
       </w:pPr>
-      <w:r/>
+      <w:r>
+        <w:t>Desafios e Soluções:</w:t>
+        <w:br/>
+        <w:t>A alta volumetria (834k linhas) foi superada pela combinação de índices GiST e Lazy Loading, eliminando gargalos de renderização no mapa Folium. A contenção de concorrência foi tratada com Connection Pooling (SQLAlchemy, 15 conexões). Para estabilidade na IA conversacional contra limites de cota da API (HTTP 429), implementou-se um fallback analítico determinístico baseado nos dados locais do banco.</w:t>
+      </w:r>
     </w:p>
     <w:p>
       <w:r/>
@@ -5895,7 +5911,17 @@
           <w:rFonts w:ascii="Arial" w:hAnsi="Arial" w:cs="Arial"/>
         </w:rPr>
       </w:pPr>
-      <w:r/>
+      <w:r>
+        <w:t>A solução foi validada com a base real de 834.385 registros criminais, alcançando os seguintes resultados operacionais:</w:t>
+        <w:br/>
+        <w:t>1. Desempenho de Banco e Mapa: Redução da carga de coordenadas do mapa de ~450 ms para 0.65 ms via Lazy Loading; consultas de raio espacial em 7.3 ms via GiST (ganho de 40x); e KPIs municipais em 0.06 ms via Materialized Views (ganho de 770x).</w:t>
+        <w:br/>
+        <w:t>2. Precisão da Modelagem Preditiva: O modelo Ridge com Fourier alcançou R² = 0.787 e RMSE = 0.23 em regiões de alta densidade (ex: Bairro Sé, Capital), delimitando horizontes preditivos com intervalos de confiança probabilísticos a 95%.</w:t>
+        <w:br/>
+        <w:t>3. Interação com Copiloto IA: Respostas táticas precisas para bairros e delitos em linguagem natural, grounded nos dados geoespaciais reais em menos de 25 ms.</w:t>
+        <w:br/>
+        <w:t>4. Confiabilidade e Testes: Cobertura de 26 testes unitários automatizados cobrindo ingestão, queries PostGIS, preditor matemático e copiloto, com 100% de aprovação em 0.16 segundos.</w:t>
+      </w:r>
     </w:p>
     <w:p>
       <w:r/>
@@ -5961,7 +5987,11 @@
           <w:rFonts w:ascii="Arial" w:hAnsi="Arial" w:cs="Arial"/>
         </w:rPr>
       </w:pPr>
-      <w:r/>
+      <w:r>
+        <w:t>O projeto atingiu integralmente seus objetivos, comprovando que a integração entre Engenharia de Dados, bancos de dados geoespaciais (PostgreSQL/PostGIS), aprendizado de máquina e IA generativa permite transformar grandes volumes de registros públicos de segurança em inteligência operacional rápida e acessível.</w:t>
+        <w:br/>
+        <w:t>A arquitetura modular e as otimizações de indexação e Lazy Loading garantem alta escalabilidade com baixo custo computacional. Como trabalhos futuros, recomenda-se a expansão da solução para outros estados, a experimentação com redes neurais recorrentes (LSTM) para séries complexas e o desenvolvimento de um aplicativo mobile para policiais em campo.</w:t>
+      </w:r>
     </w:p>
     <w:p>
       <w:r/>

</xml_diff>

<commit_message>
docs: remove mencoes a TDD e limpa secoes posteriores ao sistema pronto no RT-TDS
</commit_message>
<xml_diff>
--- a/RT-TDS-2026-018_v0.4(1).docx
+++ b/RT-TDS-2026-018_v0.4(1).docx
@@ -912,7 +912,7 @@
         <w:ind w:left="742"/>
       </w:pPr>
       <w:r>
-        <w:t>Este trabalho apresenta o desenvolvimento do Analytics Criminal SP, uma plataforma analítica e preditiva voltada à inteligência de segurança pública no Estado de São Paulo, construída sobre uma base de mais de 834.000 boletins de ocorrência da Secretaria de Segurança Pública (SSP-SP). O sistema combina engenharia de dados em larga escala no PostgreSQL 15 com a extensão geoespacial PostGIS 3.3, adotando indexação espacial GiST (R-Tree), índices compostos B-Tree e visões materializadas para alcançar consultas analíticas em tempo submilisegundo. Para a visualização, desenvolveu-se um dashboard web interativo em Streamlit aplicando estratégias de Lazy Loading espacial de coordenadas (&lt; 1 ms). A camada preditiva emprega modelagem de séries temporais com Decomposição Harmônica de Fourier para captura de sazonalidade anual de 12 meses e Regularização Ridge (L2), acompanhada de intervalos de confiança estocásticos a 95% com propagação de erro padrão SE(h) e métricas formais de validação (R², RMSE, MAE, MAPE, AIC). Adicionalmente, implementou-se um Copiloto de Inteligência Policial baseado no modelo fundacional Google Gemini 3.6 Flash integrado à barra lateral, dotado de grounding factual em tempo real e fallback resiliente a limitações de cota. O projeto foi validado por meio de 26 testes unitários automatizados (TDD) cobrindo pipeline ETL, integridade espacial e motores analíticos, demonstrando expressivo ganho de desempenho, confiabilidade e viabilidade operacional para apoio à tomada de decisões estratégicas em segurança pública.</w:t>
+        <w:t>Este trabalho apresenta o desenvolvimento do Analytics Criminal SP, uma plataforma analítica e preditiva voltada à inteligência de segurança pública no Estado de São Paulo, construída sobre uma base de mais de 834.000 boletins de ocorrência da Secretaria de Segurança Pública (SSP-SP). O sistema combina engenharia de dados em larga escala no PostgreSQL 15 com a extensão geoespacial PostGIS 3.3, adotando indexação espacial GiST (R-Tree), índices compostos B-Tree e visões materializadas para alcançar consultas analíticas em tempo submilisegundo. Para a visualização, desenvolveu-se um dashboard web interativo em Streamlit aplicando estratégias de Lazy Loading espacial de coordenadas (&lt; 1 ms). A camada preditiva emprega modelagem de séries temporais com Decomposição Harmônica de Fourier para captura de sazonalidade anual de 12 meses e Regularização Ridge (L2), acompanhada de intervalos de confiança estocásticos a 95% com propagação de erro padrão SE(h) e métricas formais de validação (R², RMSE, MAE, MAPE, AIC). Adicionalmente, implementou-se um Copiloto de Inteligência Policial baseado no modelo fundacional Google Gemini 3.6 Flash integrado à barra lateral, dotado de grounding factual em tempo real e fallback resiliente a limitações de cota. O projeto conta com uma suíte de 26 testes unitários automatizados cobrindo pipeline ETL, integridade espacial e motores analíticos, demonstrando expressivo ganho de desempenho, confiabilidade e viabilidade operacional para apoio à tomada de decisões estratégicas em segurança pública.</w:t>
       </w:r>
     </w:p>
     <w:p>
@@ -4039,7 +4039,7 @@
         <w:br/>
         <w:t>RNF05 – Usabilidade e Design: Interface gráfica limpa, moderna e minimalista desenvolvida em Streamlit com suporte a filtros recolhíveis e visualização responsiva.</w:t>
         <w:br/>
-        <w:t>RNF06 – Confiabilidade e Cobertura: Validação integral da aplicação por meio de 26 testes unitários automatizados (TDD) com 100% de taxa de aprovação.</w:t>
+        <w:t>RNF06 – Confiabilidade e Cobertura: Validação da integridade e funcionalidades da aplicação por meio de 26 testes unitários automatizados com 100% de taxa de aprovação.</w:t>
       </w:r>
     </w:p>
     <w:p>
@@ -5659,7 +5659,7 @@
         </w:rPr>
       </w:pPr>
       <w:r>
-        <w:t>O projeto foi desenvolvido sob a metodologia ágil incremental combinada com Test-Driven Development (TDD) para a garantia de qualidade e validação contínua de software. O fluxo de versionamento foi gerenciado por meio de branches no Git (com a branch de release feat/TCC), com ciclos iterativos de análise, implementação de otimizações de banco e criação de testes unitários automatizados.</w:t>
+        <w:t>O projeto foi desenvolvido sob a metodologia ágil incremental, com ciclos iterativos de análise de dados, implementação da infraestrutura geoespacial, modelagem preditiva e refinamento da interface analítica. A garantia de qualidade e estabilidade da solução é assegurada por uma suíte de 26 testes unitários automatizados cobrindo a ingestão, regras de negócio e consultas espaciais. O fluxo de trabalho e versionamento do código-fonte é gerenciado via Git, estruturado em branches de desenvolvimento e entrega (com a branch feat/TCC).</w:t>
       </w:r>
     </w:p>
     <w:p>
@@ -5810,19 +5810,7 @@
           <w:rFonts w:ascii="Arial" w:hAnsi="Arial" w:cs="Arial"/>
         </w:rPr>
       </w:pPr>
-      <w:r>
-        <w:t>O desenvolvimento do Analytics Criminal SP foi estruturado em cinco frentes técnicas integradas:</w:t>
-        <w:br/>
-        <w:t>1. Pipeline de Engenharia de Dados (ETL): Ingestão, limpeza e deduplicação de 834.385 registros públicos da SSP-SP, com filtragem espacial restrita ao Estado de São Paulo e engenharia de atributos temporais.</w:t>
-        <w:br/>
-        <w:t>2. Banco de Dados Espacial PostGIS: Persistência no PostgreSQL 15 com extensão PostGIS 3.3, coluna geométrica nativa geom (Point, 4326), indexação GiST espacial e geodésica, índices compostos e visões materializadas para agregações submilissegundo (&lt; 0.1 ms).</w:t>
-        <w:br/>
-        <w:t>3. Lazy Loading e Dashboard Reativo: Interface analítica em Streamlit com desacoplamento de carga (coordenadas geoespaciais em 0.65 ms e dados tabulares sob demanda), reduzindo em 90% o tráfego de dados no mapa Folium.</w:t>
-        <w:br/>
-        <w:t>4. Modelagem Matemática Preditiva: Estimador Ridge com expansão harmônica de Fourier (seno e cosseno de 12 meses) e propagação de incerteza (intervalos de confiança probabilísticos a 95%).</w:t>
-        <w:br/>
-        <w:t>5. Copiloto IA com Grounding em Tempo Real: Assistente baseado em Google Gemini 3.6 Flash integrado ao PostGIS via índices funcionais (&lt; 25 ms), dotado de extração de entidades e resiliência a cotas.</w:t>
-      </w:r>
+      <w:r/>
     </w:p>
     <w:p>
       <w:pPr>
@@ -5832,11 +5820,7 @@
           <w:rFonts w:ascii="Arial" w:hAnsi="Arial" w:cs="Arial"/>
         </w:rPr>
       </w:pPr>
-      <w:r>
-        <w:t>Desafios e Soluções:</w:t>
-        <w:br/>
-        <w:t>A alta volumetria (834k linhas) foi superada pela combinação de índices GiST e Lazy Loading, eliminando gargalos de renderização no mapa Folium. A contenção de concorrência foi tratada com Connection Pooling (SQLAlchemy, 15 conexões). Para estabilidade na IA conversacional contra limites de cota da API (HTTP 429), implementou-se um fallback analítico determinístico baseado nos dados locais do banco.</w:t>
-      </w:r>
+      <w:r/>
     </w:p>
     <w:p>
       <w:r/>
@@ -5911,17 +5895,7 @@
           <w:rFonts w:ascii="Arial" w:hAnsi="Arial" w:cs="Arial"/>
         </w:rPr>
       </w:pPr>
-      <w:r>
-        <w:t>A solução foi validada com a base real de 834.385 registros criminais, alcançando os seguintes resultados operacionais:</w:t>
-        <w:br/>
-        <w:t>1. Desempenho de Banco e Mapa: Redução da carga de coordenadas do mapa de ~450 ms para 0.65 ms via Lazy Loading; consultas de raio espacial em 7.3 ms via GiST (ganho de 40x); e KPIs municipais em 0.06 ms via Materialized Views (ganho de 770x).</w:t>
-        <w:br/>
-        <w:t>2. Precisão da Modelagem Preditiva: O modelo Ridge com Fourier alcançou R² = 0.787 e RMSE = 0.23 em regiões de alta densidade (ex: Bairro Sé, Capital), delimitando horizontes preditivos com intervalos de confiança probabilísticos a 95%.</w:t>
-        <w:br/>
-        <w:t>3. Interação com Copiloto IA: Respostas táticas precisas para bairros e delitos em linguagem natural, grounded nos dados geoespaciais reais em menos de 25 ms.</w:t>
-        <w:br/>
-        <w:t>4. Confiabilidade e Testes: Cobertura de 26 testes unitários automatizados cobrindo ingestão, queries PostGIS, preditor matemático e copiloto, com 100% de aprovação em 0.16 segundos.</w:t>
-      </w:r>
+      <w:r/>
     </w:p>
     <w:p>
       <w:r/>
@@ -5987,11 +5961,7 @@
           <w:rFonts w:ascii="Arial" w:hAnsi="Arial" w:cs="Arial"/>
         </w:rPr>
       </w:pPr>
-      <w:r>
-        <w:t>O projeto atingiu integralmente seus objetivos, comprovando que a integração entre Engenharia de Dados, bancos de dados geoespaciais (PostgreSQL/PostGIS), aprendizado de máquina e IA generativa permite transformar grandes volumes de registros públicos de segurança em inteligência operacional rápida e acessível.</w:t>
-        <w:br/>
-        <w:t>A arquitetura modular e as otimizações de indexação e Lazy Loading garantem alta escalabilidade com baixo custo computacional. Como trabalhos futuros, recomenda-se a expansão da solução para outros estados, a experimentação com redes neurais recorrentes (LSTM) para séries complexas e o desenvolvimento de um aplicativo mobile para policiais em campo.</w:t>
-      </w:r>
+      <w:r/>
     </w:p>
     <w:p>
       <w:r/>

</xml_diff>

<commit_message>
docs: sintetiza o resumo e simplifica os objetivos especificos no RT-TDS
</commit_message>
<xml_diff>
--- a/RT-TDS-2026-018_v0.4(1).docx
+++ b/RT-TDS-2026-018_v0.4(1).docx
@@ -912,7 +912,7 @@
         <w:ind w:left="742"/>
       </w:pPr>
       <w:r>
-        <w:t>Este trabalho apresenta o desenvolvimento do Analytics Criminal SP, uma plataforma analítica e preditiva voltada à inteligência de segurança pública no Estado de São Paulo, construída sobre uma base de mais de 834.000 boletins de ocorrência da Secretaria de Segurança Pública (SSP-SP). O sistema combina engenharia de dados em larga escala no PostgreSQL 15 com a extensão geoespacial PostGIS 3.3, adotando indexação espacial GiST (R-Tree), índices compostos B-Tree e visões materializadas para alcançar consultas analíticas em tempo submilisegundo. Para a visualização, desenvolveu-se um dashboard web interativo em Streamlit aplicando estratégias de Lazy Loading espacial de coordenadas (&lt; 1 ms). A camada preditiva emprega modelagem de séries temporais com Decomposição Harmônica de Fourier para captura de sazonalidade anual de 12 meses e Regularização Ridge (L2), acompanhada de intervalos de confiança estocásticos a 95% com propagação de erro padrão SE(h) e métricas formais de validação (R², RMSE, MAE, MAPE, AIC). Adicionalmente, implementou-se um Copiloto de Inteligência Policial baseado no modelo fundacional Google Gemini 3.6 Flash integrado à barra lateral, dotado de grounding factual em tempo real e fallback resiliente a limitações de cota. O projeto conta com uma suíte de 26 testes unitários automatizados cobrindo pipeline ETL, integridade espacial e motores analíticos, demonstrando expressivo ganho de desempenho, confiabilidade e viabilidade operacional para apoio à tomada de decisões estratégicas em segurança pública.</w:t>
+        <w:t>Este trabalho apresenta o desenvolvimento do Analytics Criminal SP, uma plataforma web voltada à análise e previsão de dados de criminalidade no Estado de São Paulo, utilizando uma base com mais de 834 mil ocorrências da Secretaria de Segurança Pública (SSP-SP). O sistema integra banco de dados geoespacial PostgreSQL com extensão PostGIS para consultas de alto desempenho, modelo preditivo de Machine Learning para projeção de tendências temporais, dashboard interativo com mapas de calor em Streamlit e um assistente inteligente (Google Gemini) para consultas em linguagem natural. A aplicação conta ainda com uma suíte de testes unitários automatizados para assegurar a qualidade e a confiabilidade do software, oferecendo uma solução prática para apoio ao planejamento e à tomada de decisão em segurança pública.</w:t>
       </w:r>
     </w:p>
     <w:p>
@@ -3292,7 +3292,7 @@
         </w:rPr>
       </w:pPr>
       <w:r>
-        <w:t>Coletar dados públicos de criminalidade urbana do Estado de São Paulo;</w:t>
+        <w:t>Coletar dados públicos de ocorrências criminais da Secretaria de Segurança Pública de São Paulo;</w:t>
       </w:r>
     </w:p>
     <w:p>
@@ -3307,7 +3307,7 @@
         </w:rPr>
       </w:pPr>
       <w:r>
-        <w:t>Implementar armazenamento e indexação geoespacial de alta performance com PostgreSQL e PostGIS;</w:t>
+        <w:t>Realizar o tratamento, higienização e validação das coordenadas geoespaciais;</w:t>
       </w:r>
     </w:p>
     <w:p>
@@ -3322,7 +3322,7 @@
         </w:rPr>
       </w:pPr>
       <w:r>
-        <w:t>Realizar o tratamento, limpeza, deduplicação e padronização das coordenadas geográficas;</w:t>
+        <w:t>Estruturar o banco de dados relacional e geoespacial utilizando PostgreSQL e PostGIS;</w:t>
       </w:r>
     </w:p>
     <w:p>
@@ -3337,7 +3337,7 @@
         </w:rPr>
       </w:pPr>
       <w:r>
-        <w:t>Desenvolver mecanismos de Lazy Loading espacial e visões materializadas para otimização de consultas;</w:t>
+        <w:t>Otimizar o tempo de resposta das consultas por meio de indexação espacial e visões materializadas;</w:t>
       </w:r>
     </w:p>
     <w:p>
@@ -3352,7 +3352,7 @@
         </w:rPr>
       </w:pPr>
       <w:r>
-        <w:t>Realizar análise estatística exploratória e diagnósticos temporais das tipologias penais;</w:t>
+        <w:t>Realizar análise estatística exploratória das ocorrências e tipologias penais;</w:t>
       </w:r>
     </w:p>
     <w:p>
@@ -3367,7 +3367,7 @@
         </w:rPr>
       </w:pPr>
       <w:r>
-        <w:t>Desenvolver modelo matemático preditivo de séries temporais com decomposição harmônica de Fourier e regularização Ridge;</w:t>
+        <w:t>Desenvolver modelo preditivo de Machine Learning para estimar tendências criminais futuras;</w:t>
       </w:r>
     </w:p>
     <w:p>
@@ -3382,7 +3382,7 @@
         </w:rPr>
       </w:pPr>
       <w:r>
-        <w:t>Implementar a propagação de incerteza para o cálculo de intervalos de confiança estocásticos a 95%;</w:t>
+        <w:t>Calcular intervalos de confiança estatísticos para as projeções temporais;</w:t>
       </w:r>
     </w:p>
     <w:p>
@@ -3397,7 +3397,7 @@
         </w:rPr>
       </w:pPr>
       <w:r>
-        <w:t>Construir um dashboard web interativo minimalista e responsivo em Streamlit;</w:t>
+        <w:t>Construir um dashboard web interativo com mapas de calor e gráficos analíticos;</w:t>
       </w:r>
     </w:p>
     <w:p>
@@ -3412,7 +3412,7 @@
         </w:rPr>
       </w:pPr>
       <w:r>
-        <w:t>Integrar um Copiloto de inteligência policial com inteligência artificial generativa e grounding factual no banco de dados.</w:t>
+        <w:t>Integrar um assistente conversacional com inteligência artificial para apoio a consultas operacionais.</w:t>
       </w:r>
     </w:p>
     <w:p>

</xml_diff>